<commit_message>
Add conclusion section to capstone report (docx + pdf)
Co-Authored-By: Claude Sonnet 4.6 <noreply@anthropic.com>
</commit_message>
<xml_diff>
--- a/reports/capstone_report.docx
+++ b/reports/capstone_report.docx
@@ -4298,6 +4298,101 @@
           <w:rFonts w:ascii="Arial" w:hAnsi="Arial"/>
           <w:color w:val="1F497D"/>
         </w:rPr>
+        <w:t>Conclusion</w:t>
+      </w:r>
+    </w:p>
+    <w:p>
+      <w:pPr>
+        <w:pBdr>
+          <w:bottom w:val="single" w:sz="4" w:space="1" w:color="AAAAAA"/>
+        </w:pBdr>
+        <w:spacing w:after="200"/>
+      </w:pPr>
+    </w:p>
+    <w:p>
+      <w:pPr>
+        <w:spacing w:after="120"/>
+      </w:pPr>
+      <w:r>
+        <w:rPr>
+          <w:rFonts w:ascii="Arial" w:hAnsi="Arial"/>
+          <w:b w:val="0"/>
+          <w:i w:val="0"/>
+          <w:sz w:val="22"/>
+        </w:rPr>
+        <w:t>This project delivered a complete, production-oriented ML pipeline for network intrusion detection using the CICIDS2017 dataset. All three technical targets set in the problem framing were met: AUC-ROC of 1.0000, attack recall of 0.9994, and FPR well below 0.05. The XGBoost tuned binary classifier is the recommended primary model, with Random Forest as a fallback that reaches near-identical performance and offers simpler operational deployment.</w:t>
+      </w:r>
+    </w:p>
+    <w:p>
+      <w:pPr>
+        <w:spacing w:after="120"/>
+      </w:pPr>
+      <w:r>
+        <w:rPr>
+          <w:rFonts w:ascii="Arial" w:hAnsi="Arial"/>
+          <w:b w:val="0"/>
+          <w:i w:val="0"/>
+          <w:sz w:val="22"/>
+        </w:rPr>
+        <w:t>The multiclass extension demonstrated that the same pipeline generalises to nine-class attack categorisation with macro F1 of 0.9667, with the primary limitation being Botnet and Infiltration recall due to extreme class underrepresentation — a known characteristic of CICIDS2017 rather than a modelling failure.</w:t>
+      </w:r>
+    </w:p>
+    <w:p>
+      <w:pPr>
+        <w:spacing w:after="120"/>
+      </w:pPr>
+      <w:r>
+        <w:rPr>
+          <w:rFonts w:ascii="Arial" w:hAnsi="Arial"/>
+          <w:b w:val="0"/>
+          <w:i w:val="0"/>
+          <w:sz w:val="22"/>
+        </w:rPr>
+        <w:t>Several findings stand out beyond the headline metrics. The engineered byte_asymmetry feature ranked first in SHAP importance, above all 66 original CICFlowMeter columns, validating the value of domain-driven feature engineering. Cross-validation stability of 0.9990 +/- 0.0001 across five folds confirms the results are not an artifact of a favorable data split. The fairness audit found no evidence of disparate model errors across traffic segments: while the Disparate Impact Ratio fell below 0.80 in both audited dimensions, this was attributable entirely to genuine base-rate differences in attack concentration across groups, not to unequal error rates. Equalized odds was effectively satisfied, with FPR and FNR ranges near zero across all groups.</w:t>
+      </w:r>
+    </w:p>
+    <w:p>
+      <w:pPr>
+        <w:spacing w:after="120"/>
+      </w:pPr>
+      <w:r>
+        <w:rPr>
+          <w:rFonts w:ascii="Arial" w:hAnsi="Arial"/>
+          <w:b w:val="0"/>
+          <w:i w:val="0"/>
+          <w:sz w:val="22"/>
+        </w:rPr>
+        <w:t>The principal limitations for production deployment are temporal drift (the dataset captures 2017 traffic), real-time latency for flow-level features that require connection close, and adversarial evasion risk. All three have documented mitigation paths: PSI-based drift monitoring, a sub-flow early-detection model, and adversarial training, respectively.</w:t>
+      </w:r>
+    </w:p>
+    <w:p>
+      <w:pPr>
+        <w:spacing w:after="120"/>
+      </w:pPr>
+      <w:r>
+        <w:rPr>
+          <w:rFonts w:ascii="Arial" w:hAnsi="Arial"/>
+          <w:b w:val="0"/>
+          <w:i w:val="0"/>
+          <w:sz w:val="22"/>
+        </w:rPr>
+        <w:t>From a business standpoint, the model's performance translates directly to reduced SOC analyst workload. A false positive rate below 0.06% against the 20% attack prevalence in this dataset means fewer than one in a thousand benign flows would generate a false alert, enabling meaningful reduction in triage time and cost. Combined with a recall of 99.94%, the system provides near-complete detection coverage while keeping analyst fatigue in check — the two competing operational demands that motivated this project.</w:t>
+      </w:r>
+    </w:p>
+    <w:p>
+      <w:r>
+        <w:br w:type="page"/>
+      </w:r>
+    </w:p>
+    <w:p>
+      <w:pPr>
+        <w:pStyle w:val="Heading1"/>
+      </w:pPr>
+      <w:r>
+        <w:rPr>
+          <w:rFonts w:ascii="Arial" w:hAnsi="Arial"/>
+          <w:color w:val="1F497D"/>
+        </w:rPr>
         <w:t>GitHub Repository</w:t>
       </w:r>
     </w:p>

</xml_diff>